<commit_message>
Week 8 Labs Complete
</commit_message>
<xml_diff>
--- a/WebDev Summarised.docx
+++ b/WebDev Summarised.docx
@@ -3454,6 +3454,7 @@
         <w:rPr>
           <w:i/>
           <w:iCs/>
+          <w:noProof/>
           <w:sz w:val="22"/>
           <w:szCs w:val="22"/>
         </w:rPr>
@@ -3849,6 +3850,9 @@
         </w:rPr>
       </w:pPr>
       <w:r>
+        <w:rPr>
+          <w:noProof/>
+        </w:rPr>
         <w:drawing>
           <wp:anchor distT="0" distB="0" distL="114300" distR="114300" simplePos="0" relativeHeight="251661312" behindDoc="0" locked="0" layoutInCell="1" allowOverlap="1" wp14:anchorId="3A18109D" wp14:editId="58CE6AAB">
             <wp:simplePos x="0" y="0"/>
@@ -4913,9 +4917,20 @@
     </w:p>
     <w:p>
       <w:pPr>
+        <w:ind w:left="360"/>
+      </w:pPr>
+    </w:p>
+    <w:p>
+      <w:pPr>
+        <w:ind w:left="360"/>
+      </w:pPr>
+    </w:p>
+    <w:p>
+      <w:pPr>
         <w:pStyle w:val="Heading2"/>
       </w:pPr>
       <w:r>
+        <w:lastRenderedPageBreak/>
         <w:t>Handlebars Help</w:t>
       </w:r>
       <w:r>
@@ -4980,7 +4995,6 @@
           <w:b/>
           <w:bCs/>
         </w:rPr>
-        <w:lastRenderedPageBreak/>
         <w:t>With</w:t>
       </w:r>
       <w:r>
@@ -5157,6 +5171,9 @@
         <w:pStyle w:val="ListParagraph"/>
       </w:pPr>
       <w:r>
+        <w:rPr>
+          <w:noProof/>
+        </w:rPr>
         <w:drawing>
           <wp:inline distT="0" distB="0" distL="0" distR="0" wp14:anchorId="0D2D4407" wp14:editId="151C7103">
             <wp:extent cx="3318933" cy="1333677"/>
@@ -5194,6 +5211,198 @@
         </w:drawing>
       </w:r>
     </w:p>
+    <w:p/>
+    <w:p>
+      <w:pPr>
+        <w:pStyle w:val="Heading2"/>
+      </w:pPr>
+      <w:r>
+        <w:t>Forms</w:t>
+      </w:r>
+    </w:p>
+    <w:p>
+      <w:pPr>
+        <w:pStyle w:val="ListParagraph"/>
+        <w:numPr>
+          <w:ilvl w:val="0"/>
+          <w:numId w:val="20"/>
+        </w:numPr>
+      </w:pPr>
+      <w:r>
+        <w:t>N</w:t>
+      </w:r>
+      <w:r>
+        <w:t>eeds</w:t>
+      </w:r>
+      <w:r>
+        <w:t xml:space="preserve"> a ‘name’, ‘label’ and an ‘id’.</w:t>
+      </w:r>
+    </w:p>
+    <w:p>
+      <w:pPr>
+        <w:pStyle w:val="ListParagraph"/>
+        <w:numPr>
+          <w:ilvl w:val="0"/>
+          <w:numId w:val="20"/>
+        </w:numPr>
+      </w:pPr>
+      <w:r>
+        <w:t>Submitted using button, can tell it what to do through eventListener().</w:t>
+      </w:r>
+    </w:p>
+    <w:p>
+      <w:pPr>
+        <w:pStyle w:val="ListParagraph"/>
+        <w:numPr>
+          <w:ilvl w:val="0"/>
+          <w:numId w:val="20"/>
+        </w:numPr>
+      </w:pPr>
+      <w:r>
+        <w:t>‘preventDefault()’ cancels the usual event (sending data to server).</w:t>
+      </w:r>
+    </w:p>
+    <w:p>
+      <w:pPr>
+        <w:pStyle w:val="ListParagraph"/>
+        <w:numPr>
+          <w:ilvl w:val="0"/>
+          <w:numId w:val="20"/>
+        </w:numPr>
+      </w:pPr>
+      <w:r>
+        <w:t>We can use ‘form.elements.</w:t>
+      </w:r>
+      <w:r>
+        <w:t>elementname’ to access specific elements.</w:t>
+      </w:r>
+    </w:p>
+    <w:p>
+      <w:pPr>
+        <w:pStyle w:val="ListParagraph"/>
+        <w:numPr>
+          <w:ilvl w:val="0"/>
+          <w:numId w:val="20"/>
+        </w:numPr>
+      </w:pPr>
+      <w:r>
+        <w:t>Use value at the end to use value of that element.</w:t>
+      </w:r>
+    </w:p>
+    <w:p>
+      <w:pPr>
+        <w:pStyle w:val="ListParagraph"/>
+        <w:numPr>
+          <w:ilvl w:val="0"/>
+          <w:numId w:val="20"/>
+        </w:numPr>
+      </w:pPr>
+      <w:r>
+        <w:rPr>
+          <w:b/>
+          <w:bCs/>
+        </w:rPr>
+        <w:t xml:space="preserve">Checkboxes: </w:t>
+      </w:r>
+      <w:r>
+        <w:t>Selected</w:t>
+      </w:r>
+      <w:r>
+        <w:t xml:space="preserve"> values will have checked attribute.</w:t>
+      </w:r>
+    </w:p>
+    <w:p>
+      <w:pPr>
+        <w:pStyle w:val="ListParagraph"/>
+        <w:numPr>
+          <w:ilvl w:val="0"/>
+          <w:numId w:val="20"/>
+        </w:numPr>
+      </w:pPr>
+      <w:r>
+        <w:rPr>
+          <w:b/>
+          <w:bCs/>
+        </w:rPr>
+        <w:t xml:space="preserve">Radio: </w:t>
+      </w:r>
+      <w:r>
+        <w:t>Can get the value</w:t>
+      </w:r>
+      <w:r>
+        <w:t xml:space="preserve"> selected</w:t>
+      </w:r>
+      <w:r>
+        <w:t xml:space="preserve"> using the value property.</w:t>
+      </w:r>
+    </w:p>
+    <w:p>
+      <w:pPr>
+        <w:pStyle w:val="ListParagraph"/>
+        <w:numPr>
+          <w:ilvl w:val="0"/>
+          <w:numId w:val="20"/>
+        </w:numPr>
+      </w:pPr>
+      <w:r>
+        <w:rPr>
+          <w:b/>
+          <w:bCs/>
+        </w:rPr>
+        <w:t xml:space="preserve">Menu: </w:t>
+      </w:r>
+      <w:r>
+        <w:t>Work the same as radios.</w:t>
+      </w:r>
+      <w:r>
+        <w:t xml:space="preserve"> Can get index via ‘selectedIndex’.</w:t>
+      </w:r>
+    </w:p>
+    <w:p>
+      <w:pPr>
+        <w:pStyle w:val="ListParagraph"/>
+        <w:numPr>
+          <w:ilvl w:val="0"/>
+          <w:numId w:val="20"/>
+        </w:numPr>
+      </w:pPr>
+      <w:r>
+        <w:t>Used for search bars to search array</w:t>
+      </w:r>
+      <w:r>
+        <w:t xml:space="preserve"> l</w:t>
+      </w:r>
+      <w:r>
+        <w:t>ists</w:t>
+      </w:r>
+      <w:r>
+        <w:t>.</w:t>
+      </w:r>
+    </w:p>
+    <w:p>
+      <w:pPr>
+        <w:pStyle w:val="ListParagraph"/>
+        <w:numPr>
+          <w:ilvl w:val="0"/>
+          <w:numId w:val="20"/>
+        </w:numPr>
+      </w:pPr>
+      <w:r>
+        <w:t>Should show results while typing (t, shows Toyota and Tesla)</w:t>
+      </w:r>
+    </w:p>
+    <w:p>
+      <w:pPr>
+        <w:pStyle w:val="ListParagraph"/>
+        <w:numPr>
+          <w:ilvl w:val="0"/>
+          <w:numId w:val="20"/>
+        </w:numPr>
+      </w:pPr>
+      <w:r>
+        <w:t>Can use dropdown menus.</w:t>
+      </w:r>
+    </w:p>
     <w:sectPr>
       <w:headerReference w:type="default" r:id="rId14"/>
       <w:footerReference w:type="default" r:id="rId15"/>
@@ -5241,7 +5450,6 @@
         <w:docPartUnique/>
       </w:docPartObj>
     </w:sdtPr>
-    <w:sdtEndPr/>
     <w:sdtContent>
       <w:p>
         <w:pPr>
@@ -7485,7 +7693,7 @@
   <w:abstractNum w:abstractNumId="19" w15:restartNumberingAfterBreak="0">
     <w:nsid w:val="7A2A6191"/>
     <w:multiLevelType w:val="hybridMultilevel"/>
-    <w:tmpl w:val="775EB20C"/>
+    <w:tmpl w:val="EE0A80B0"/>
     <w:lvl w:ilvl="0" w:tplc="18090001">
       <w:start w:val="1"/>
       <w:numFmt w:val="bullet"/>

</xml_diff>